<commit_message>
docs(proposal): update Paket 3 Executive to Rp 27 Juta with domain kaisargym.com and 1-year cloud server included
</commit_message>
<xml_diff>
--- a/PROPOSAL PENGEMBANGAN APLIKASI FITNESS MEMBERSHIP (REVISI).docx
+++ b/PROPOSAL PENGEMBANGAN APLIKASI FITNESS MEMBERSHIP (REVISI).docx
@@ -611,7 +611,7 @@
                 <w:color w:val="B45309"/>
                 <w:sz w:val="19"/>
               </w:rPr>
-              <w:t>Rp 30.000.000</w:t>
+              <w:t>Rp 27.000.000</w:t>
             </w:r>
           </w:p>
         </w:tc>
@@ -633,7 +633,7 @@
                 <w:color w:val="0A1128"/>
                 <w:sz w:val="19"/>
               </w:rPr>
-              <w:t>Kendali bisnis di HP Owner, Mobile Live Dashboard &amp; Garansi 4 Bulan.</w:t>
+              <w:t>Kendali bisnis di HP Owner, Mobile Live Dashboard, Garansi 4 Bulan, Inc. Domain kaisargym.com &amp; Dedicated Server 1 Tahun.</w:t>
             </w:r>
           </w:p>
         </w:tc>
@@ -1543,7 +1543,7 @@
           <w:color w:val="B45309"/>
           <w:sz w:val="22"/>
         </w:rPr>
-        <w:t>C. RINCIAN PAKET 3: EXECUTIVE SMART GYM - Rp 30.000.000 ★</w:t>
+        <w:t>C. RINCIAN PAKET 3: EXECUTIVE SMART GYM - Rp 27.000.000 ★</w:t>
       </w:r>
     </w:p>
     <w:p>
@@ -1728,6 +1728,57 @@
           <w:sz w:val="20"/>
         </w:rPr>
         <w:t>Statistik otomatis performa pelatih terlaris (Top Performance Coach), produktivitas sales, serta persentase retensi member aktif.</w:t>
+      </w:r>
+    </w:p>
+    <w:p>
+      <w:pPr>
+        <w:spacing w:before="30" w:after="50"/>
+        <w:ind w:left="360"/>
+      </w:pPr>
+      <w:r>
+        <w:rPr>
+          <w:b/>
+          <w:color w:val="B45309"/>
+          <w:sz w:val="20"/>
+        </w:rPr>
+        <w:t xml:space="preserve">■ </w:t>
+      </w:r>
+      <w:r>
+        <w:rPr>
+          <w:b/>
+          <w:color w:val="0A1128"/>
+          <w:sz w:val="21"/>
+        </w:rPr>
+        <w:t>🌐 Infrastruktur Lengkap &amp; Domain Resmi:</w:t>
+      </w:r>
+    </w:p>
+    <w:p>
+      <w:pPr>
+        <w:spacing w:before="30" w:after="50"/>
+        <w:ind w:left="720"/>
+      </w:pPr>
+      <w:r>
+        <w:rPr>
+          <w:b/>
+          <w:color w:val="0A1128"/>
+          <w:sz w:val="20"/>
+        </w:rPr>
+        <w:t xml:space="preserve">• </w:t>
+      </w:r>
+      <w:r>
+        <w:rPr>
+          <w:b/>
+          <w:color w:val="0A1128"/>
+          <w:sz w:val="20"/>
+        </w:rPr>
+        <w:t xml:space="preserve">Include Domain kaisargym.com &amp; Server Cloud (1 Tahun): </w:t>
+      </w:r>
+      <w:r>
+        <w:rPr>
+          <w:color w:val="1E293B"/>
+          <w:sz w:val="20"/>
+        </w:rPr>
+        <w:t>Sudah termasuk biaya pendaftaran/perpanjangan domain resmi kaisargym.com dan dedicated cloud server performa tinggi selama 1 (satu) tahun penuh tanpa biaya tambahan.</w:t>
       </w:r>
     </w:p>
     <w:p>
@@ -2185,7 +2236,7 @@
               </w:rPr>
               <w:t>PAKET EXECUTIVE</w:t>
               <w:br/>
-              <w:t>(Rp 30 Jt) ★</w:t>
+              <w:t>(Rp 27 Jt) ★</w:t>
             </w:r>
           </w:p>
         </w:tc>
@@ -2610,7 +2661,7 @@
                 <w:color w:val="0A1128"/>
                 <w:sz w:val="17"/>
               </w:rPr>
-              <w:t>Portal Personal Trainer (Cek Sesi di HP/Tablet)</w:t>
+              <w:t>Domain kaisargym.com &amp; Server Cloud 1 Tahun</w:t>
             </w:r>
           </w:p>
         </w:tc>
@@ -2631,10 +2682,9 @@
             </w:pPr>
             <w:r>
               <w:rPr>
-                <w:color w:val="94A3B8"/>
                 <w:sz w:val="17"/>
               </w:rPr>
-              <w:t>Tidak Ada</w:t>
+              <w:t>Standar</w:t>
             </w:r>
           </w:p>
         </w:tc>
@@ -2655,10 +2705,9 @@
             </w:pPr>
             <w:r>
               <w:rPr>
-                <w:color w:val="166534"/>
                 <w:sz w:val="17"/>
               </w:rPr>
-              <w:t>Tersedia</w:t>
+              <w:t>Include 1 Thn</w:t>
             </w:r>
           </w:p>
         </w:tc>
@@ -2683,7 +2732,7 @@
                 <w:color w:val="B45309"/>
                 <w:sz w:val="17"/>
               </w:rPr>
-              <w:t>Tersedia</w:t>
+              <w:t>Include 1 Thn (High-Speed)</w:t>
             </w:r>
           </w:p>
         </w:tc>
@@ -2710,7 +2759,7 @@
                 <w:color w:val="0A1128"/>
                 <w:sz w:val="17"/>
               </w:rPr>
-              <w:t>Kalkulasi Komisi PT Otomatis (Tetap vs Freelance)</w:t>
+              <w:t>Portal Personal Trainer (Cek Sesi di HP/Tablet)</w:t>
             </w:r>
           </w:p>
         </w:tc>
@@ -2810,7 +2859,7 @@
                 <w:color w:val="0A1128"/>
                 <w:sz w:val="17"/>
               </w:rPr>
-              <w:t>Portal Mandiri Member (Cek Masa Aktif dari HP)</w:t>
+              <w:t>Kalkulasi Komisi PT Otomatis (Tetap vs Freelance)</w:t>
             </w:r>
           </w:p>
         </w:tc>
@@ -2910,7 +2959,7 @@
                 <w:color w:val="0A1128"/>
                 <w:sz w:val="17"/>
               </w:rPr>
-              <w:t>Mobile Executive Dashboard di Layar HP Owner</w:t>
+              <w:t>Portal Mandiri Member (Cek Masa Aktif dari HP)</w:t>
             </w:r>
           </w:p>
         </w:tc>
@@ -2955,9 +3004,10 @@
             </w:pPr>
             <w:r>
               <w:rPr>
+                <w:color w:val="166534"/>
                 <w:sz w:val="17"/>
               </w:rPr>
-              <w:t>Basic (Web)</w:t>
+              <w:t>Tersedia</w:t>
             </w:r>
           </w:p>
         </w:tc>
@@ -2982,7 +3032,7 @@
                 <w:color w:val="B45309"/>
                 <w:sz w:val="17"/>
               </w:rPr>
-              <w:t>Executive Pro (Live App)</w:t>
+              <w:t>Tersedia</w:t>
             </w:r>
           </w:p>
         </w:tc>
@@ -3009,7 +3059,7 @@
                 <w:color w:val="0A1128"/>
                 <w:sz w:val="17"/>
               </w:rPr>
-              <w:t>Trainer &amp; Sales Leaderboard Performance</w:t>
+              <w:t>Mobile Executive Dashboard di Layar HP Owner</w:t>
             </w:r>
           </w:p>
         </w:tc>
@@ -3056,7 +3106,7 @@
               <w:rPr>
                 <w:sz w:val="17"/>
               </w:rPr>
-              <w:t>Tabel Biasa</w:t>
+              <w:t>Basic (Web)</w:t>
             </w:r>
           </w:p>
         </w:tc>
@@ -3081,7 +3131,7 @@
                 <w:color w:val="B45309"/>
                 <w:sz w:val="17"/>
               </w:rPr>
-              <w:t>Leaderboard Otomatis</w:t>
+              <w:t>Executive Pro (Live App)</w:t>
             </w:r>
           </w:p>
         </w:tc>
@@ -3108,7 +3158,7 @@
                 <w:color w:val="0A1128"/>
                 <w:sz w:val="17"/>
               </w:rPr>
-              <w:t>Masa Garansi &amp; Pendampingan Sistem</w:t>
+              <w:t>Trainer &amp; Sales Leaderboard Performance</w:t>
             </w:r>
           </w:p>
         </w:tc>
@@ -3129,9 +3179,10 @@
             </w:pPr>
             <w:r>
               <w:rPr>
+                <w:color w:val="94A3B8"/>
                 <w:sz w:val="17"/>
               </w:rPr>
-              <w:t>1 Bulan</w:t>
+              <w:t>Tidak Ada</w:t>
             </w:r>
           </w:p>
         </w:tc>
@@ -3154,7 +3205,7 @@
               <w:rPr>
                 <w:sz w:val="17"/>
               </w:rPr>
-              <w:t>3 Bulan</w:t>
+              <w:t>Tabel Biasa</w:t>
             </w:r>
           </w:p>
         </w:tc>
@@ -3162,6 +3213,104 @@
           <w:tcPr>
             <w:tcW w:type="dxa" w:w="2365"/>
             <w:shd w:fill="FFFFFF"/>
+            <w:tcMar>
+              <w:top w:w="70" w:type="dxa"/>
+              <w:bottom w:w="70" w:type="dxa"/>
+              <w:left w:w="90" w:type="dxa"/>
+              <w:right w:w="90" w:type="dxa"/>
+            </w:tcMar>
+          </w:tcPr>
+          <w:p>
+            <w:pPr>
+              <w:jc w:val="center"/>
+            </w:pPr>
+            <w:r>
+              <w:rPr>
+                <w:b/>
+                <w:color w:val="B45309"/>
+                <w:sz w:val="17"/>
+              </w:rPr>
+              <w:t>Leaderboard Otomatis</w:t>
+            </w:r>
+          </w:p>
+        </w:tc>
+      </w:tr>
+      <w:tr>
+        <w:tc>
+          <w:tcPr>
+            <w:tcW w:type="dxa" w:w="2365"/>
+            <w:shd w:fill="F8FAFC"/>
+            <w:tcMar>
+              <w:top w:w="70" w:type="dxa"/>
+              <w:bottom w:w="70" w:type="dxa"/>
+              <w:left w:w="90" w:type="dxa"/>
+              <w:right w:w="90" w:type="dxa"/>
+            </w:tcMar>
+          </w:tcPr>
+          <w:p>
+            <w:pPr>
+              <w:jc w:val="left"/>
+            </w:pPr>
+            <w:r>
+              <w:rPr>
+                <w:b/>
+                <w:color w:val="0A1128"/>
+                <w:sz w:val="17"/>
+              </w:rPr>
+              <w:t>Masa Garansi &amp; Pendampingan Sistem</w:t>
+            </w:r>
+          </w:p>
+        </w:tc>
+        <w:tc>
+          <w:tcPr>
+            <w:tcW w:type="dxa" w:w="2365"/>
+            <w:shd w:fill="F8FAFC"/>
+            <w:tcMar>
+              <w:top w:w="70" w:type="dxa"/>
+              <w:bottom w:w="70" w:type="dxa"/>
+              <w:left w:w="90" w:type="dxa"/>
+              <w:right w:w="90" w:type="dxa"/>
+            </w:tcMar>
+          </w:tcPr>
+          <w:p>
+            <w:pPr>
+              <w:jc w:val="center"/>
+            </w:pPr>
+            <w:r>
+              <w:rPr>
+                <w:sz w:val="17"/>
+              </w:rPr>
+              <w:t>1 Bulan</w:t>
+            </w:r>
+          </w:p>
+        </w:tc>
+        <w:tc>
+          <w:tcPr>
+            <w:tcW w:type="dxa" w:w="2365"/>
+            <w:shd w:fill="F8FAFC"/>
+            <w:tcMar>
+              <w:top w:w="70" w:type="dxa"/>
+              <w:bottom w:w="70" w:type="dxa"/>
+              <w:left w:w="90" w:type="dxa"/>
+              <w:right w:w="90" w:type="dxa"/>
+            </w:tcMar>
+          </w:tcPr>
+          <w:p>
+            <w:pPr>
+              <w:jc w:val="center"/>
+            </w:pPr>
+            <w:r>
+              <w:rPr>
+                <w:sz w:val="17"/>
+              </w:rPr>
+              <w:t>3 Bulan</w:t>
+            </w:r>
+          </w:p>
+        </w:tc>
+        <w:tc>
+          <w:tcPr>
+            <w:tcW w:type="dxa" w:w="2365"/>
+            <w:shd w:fill="F8FAFC"/>
             <w:tcMar>
               <w:top w:w="70" w:type="dxa"/>
               <w:bottom w:w="70" w:type="dxa"/>
@@ -3565,7 +3714,7 @@
           <w:b/>
           <w:color w:val="B45309"/>
         </w:rPr>
-        <w:t>[   ]  PAKET 3: EXECUTIVE SMART GYM (Rp 30.000.000,-) ★ Rekomendasi Utama</w:t>
+        <w:t>[   ]  PAKET 3: EXECUTIVE SMART GYM (Rp 27.000.000,-) ★ Rekomendasi Utama (Include Domain &amp; Server 1 Tahun)</w:t>
       </w:r>
     </w:p>
     <w:p>

</xml_diff>